<commit_message>
Clarify submission evidence, improve presentations and document validation plans
</commit_message>
<xml_diff>
--- a/reports/Franklin_Guillano_DIAL_ALERT_EDA_Feature_Engineering_Report.docx
+++ b/reports/Franklin_Guillano_DIAL_ALERT_EDA_Feature_Engineering_Report.docx
@@ -2950,7 +2950,7 @@
                 <w:rFonts w:ascii="Arial" w:hAnsi="Arial" w:eastAsia="Arial"/>
                 <w:sz w:val="15"/>
               </w:rPr>
-              <w:t>Sessions removed for follow-up below 120 minutes</w:t>
+              <w:t>Sessions removed because last dialysis minute was below 120</w:t>
             </w:r>
           </w:p>
         </w:tc>
@@ -6819,7 +6819,7 @@
         <w:rPr>
           <w:rFonts w:ascii="Arial" w:hAnsi="Arial" w:eastAsia="Arial"/>
         </w:rPr>
-        <w:t>PCA logistic regression achieved grouped cross-validation average precision of 0.410, compared with 0.444 for histogram gradient boosting. PCA was therefore documented as a dimensionality-reduction benchmark rather than selected for the final predictor. Its lower performance and reduced feature-level interpretability outweighed its compression benefit for this dataset.</w:t>
+        <w:t>PCA logistic regression achieved grouped cross-validation average precision of 0.410, compared with 0.446 for histogram gradient boosting. PCA was therefore documented as a dimensionality-reduction benchmark rather than selected for the final predictor. Its lower performance and reduced feature-level interpretability outweighed its compression benefit for this dataset.</w:t>
       </w:r>
     </w:p>
     <w:p>

</xml_diff>

<commit_message>
Align submission reports and slides and verify local inference
</commit_message>
<xml_diff>
--- a/reports/Franklin_Guillano_DIAL_ALERT_EDA_Feature_Engineering_Report.docx
+++ b/reports/Franklin_Guillano_DIAL_ALERT_EDA_Feature_Engineering_Report.docx
@@ -1107,7 +1107,7 @@
                 <w:rFonts w:ascii="Arial" w:hAnsi="Arial" w:eastAsia="Arial"/>
                 <w:sz w:val="18"/>
               </w:rPr>
-              <w:t>Index SBP at least 90 mmHg, at least two later distinct minutes, and observation through at least minute 120</w:t>
+              <w:t>Index SBP at least 90 mmHg, at least two later distinct minutes, and an observation at or beyond dialysis minute 120</w:t>
             </w:r>
           </w:p>
         </w:tc>
@@ -2950,7 +2950,7 @@
                 <w:rFonts w:ascii="Arial" w:hAnsi="Arial" w:eastAsia="Arial"/>
                 <w:sz w:val="15"/>
               </w:rPr>
-              <w:t>Sessions removed for follow-up below 120 minutes</w:t>
+              <w:t>Sessions with last observed dialysis minute below 120</w:t>
             </w:r>
           </w:p>
         </w:tc>
@@ -6819,7 +6819,7 @@
         <w:rPr>
           <w:rFonts w:ascii="Arial" w:hAnsi="Arial" w:eastAsia="Arial"/>
         </w:rPr>
-        <w:t>PCA logistic regression achieved grouped cross-validation average precision of 0.410, compared with 0.444 for histogram gradient boosting. PCA was therefore documented as a dimensionality-reduction benchmark rather than selected for the final predictor. Its lower performance and reduced feature-level interpretability outweighed its compression benefit for this dataset.</w:t>
+        <w:t>PCA logistic regression achieved grouped cross-validation average precision of 0.410, compared with 0.446 for histogram gradient boosting. PCA was therefore documented as a dimensionality-reduction benchmark rather than selected for the final predictor. Its lower performance and reduced feature-level interpretability outweighed its compression benefit for this dataset.</w:t>
       </w:r>
     </w:p>
     <w:p>
@@ -6840,7 +6840,7 @@
         <w:rPr>
           <w:rFonts w:ascii="Arial" w:hAnsi="Arial" w:eastAsia="Arial"/>
         </w:rPr>
-        <w:t>Permutation importance measures the reduction in test-set average precision after a feature is shuffled. Previous-session nadir SBP produced the largest decrease (0.128), followed by prior IDH rate (0.081), fluid excess percentage (0.015), baseline SBP (0.009), and baseline mean arterial pressure (0.004). Near-zero or negative values can occur when predictors are redundant or when finite-sample variation exceeds the feature's unique contribution.</w:t>
+        <w:t>Permutation importance measures the reduction in test-set average precision after a feature is shuffled. Previous-session nadir SBP produced the largest decrease (0.076), followed by prior IDH rate (0.059), previous-session IDH (0.017), baseline SBP (0.014), and baseline mean arterial pressure (0.009). Near-zero or negative values can occur when predictors are redundant or when finite-sample variation exceeds the feature's unique contribution.</w:t>
       </w:r>
     </w:p>
     <w:p>
@@ -7775,7 +7775,7 @@
         <w:rPr>
           <w:rFonts w:ascii="Arial" w:hAnsi="Arial" w:eastAsia="Arial"/>
         </w:rPr>
-        <w:t>SHAP explanations were generated for the uncalibrated base model because probability calibration does not change the underlying predictor relationships. Only aggregate mean absolute contributions are published. The summary confirms that previous-session nadir pressure, prior IDH rate, and fluid excess dominate model output. SHAP values describe the fitted model and do not prove that modifying a feature would change a patient's outcome.</w:t>
+        <w:t>SHAP explanations describe the selected random forest; no post-hoc calibration was applied. Only aggregate mean absolute contributions are published. The summary confirms that previous-session nadir pressure, prior IDH rate, and fluid excess dominate model output. SHAP values describe the fitted model and do not prove that modifying a feature would change a patient's outcome.</w:t>
       </w:r>
     </w:p>
     <w:p>

</xml_diff>